<commit_message>
updated .py files, uploaded .docx in data
</commit_message>
<xml_diff>
--- a/data/profile.docx
+++ b/data/profile.docx
@@ -45,6 +45,7 @@
         <w:t>Technical Trainer | Cloud &amp; Infrastructure | Turning Complex Technology into Engaging Learning Experiences</w:t>
       </w:r>
     </w:p>
+    <w:p/>
     <w:p>
       <w:r>
         <w:t>Sydney, New South Wales, Australia</w:t>
@@ -60,6 +61,9 @@
     </w:p>
     <w:p>
       <w:r>
+        <w:rPr>
+          <w:noProof/>
+        </w:rPr>
         <w:drawing>
           <wp:inline distT="0" distB="0" distL="0" distR="0" wp14:anchorId="42117315" wp14:editId="61C99BE7">
             <wp:extent cx="952500" cy="952500"/>
@@ -127,6 +131,9 @@
     </w:p>
     <w:p>
       <w:r>
+        <w:rPr>
+          <w:noProof/>
+        </w:rPr>
         <w:drawing>
           <wp:inline distT="0" distB="0" distL="0" distR="0" wp14:anchorId="3278D23C" wp14:editId="6C3AB189">
             <wp:extent cx="952500" cy="952500"/>
@@ -224,6 +231,14 @@
           <w:bCs/>
         </w:rPr>
       </w:pPr>
+    </w:p>
+    <w:p>
+      <w:pPr>
+        <w:rPr>
+          <w:b/>
+          <w:bCs/>
+        </w:rPr>
+      </w:pPr>
       <w:r>
         <w:rPr>
           <w:b/>
@@ -244,6 +259,8 @@
         <w:br/>
         <w:t>That fascination with understanding how things worked eventually led me to buy a book on Visual Basic in primary school and build my first programs on Windows 98. It also helped me make a few friends along the way - usually by helping connect their SNES consoles to their grandma’s TVs.</w:t>
       </w:r>
+    </w:p>
+    <w:p>
       <w:r>
         <w:br/>
         <w:t> </w:t>
@@ -254,6 +271,9 @@
       </w:r>
       <w:r>
         <w:br/>
+      </w:r>
+      <w:r>
+        <w:lastRenderedPageBreak/>
         <w:t> </w:t>
       </w:r>
       <w:r>
@@ -266,87 +286,102 @@
       </w:r>
       <w:r>
         <w:br/>
-      </w:r>
-      <w:r>
+        <w:t xml:space="preserve">My studies and industry experience allowed me to explore both sides of that curiosity. I found myself not only solving technical </w:t>
+      </w:r>
+      <w:proofErr w:type="gramStart"/>
+      <w:r>
+        <w:t>problems, but</w:t>
+      </w:r>
+      <w:proofErr w:type="gramEnd"/>
+      <w:r>
+        <w:t xml:space="preserve"> also explaining them - translating complex concepts into practical and meaningful conversations for people without technical backgrounds. That realisation eventually influenced my decision to broaden my studies beyond technology and into areas focused on people, recognising that even the most successful technology still depends on people using it with confidence.</w:t>
+      </w:r>
+      <w:r>
+        <w:br/>
+        <w:t> </w:t>
+      </w:r>
+    </w:p>
+    <w:p>
+      <w:r>
+        <w:br/>
+        <w:t>More than 20 years later, I still enjoy every small fix, every successful Lambda call and every SageMaker training job completed with the same curiosity I had fixing that first radio. While the technology has changed - evolving from consumer electronics to infrastructure, Cloud and now AI - the principle has remained the same: curiosity and perseverance.</w:t>
+      </w:r>
+      <w:r>
+        <w:br/>
+      </w:r>
+    </w:p>
+    <w:p>
+      <w:r>
+        <w:t> </w:t>
+      </w:r>
+      <w:r>
+        <w:br/>
+        <w:t>Over time, my career evolved into becoming an in-betweener, communicator and translator between technical teams and the broader business - helping bridge silos, build understanding and align people around shared goals. Whether supporting a CEO making a technical decision or mentoring someone new to IT, I enjoy making technology feel less intimidating and more useful.</w:t>
+      </w:r>
+      <w:r>
+        <w:br/>
+        <w:t> </w:t>
+      </w:r>
+      <w:r>
+        <w:br/>
+        <w:t>Through mentoring and coaching, I’ve learned that sometimes the best approach is not to give the answer, but to point people in the right direction and empower them to come up with even better ideas themselves.</w:t>
+      </w:r>
+      <w:r>
+        <w:br/>
+        <w:t> </w:t>
+      </w:r>
+      <w:r>
+        <w:br/>
+        <w:t xml:space="preserve">I’m always open to connecting with others to share ideas, industry insights or simply talk technology, people and the spaces where they intersect. If this resonates - let’s connect </w:t>
+      </w:r>
+      <w:r>
+        <w:rPr>
+          <w:rFonts w:ascii="Segoe UI Emoji" w:hAnsi="Segoe UI Emoji" w:cs="Segoe UI Emoji"/>
+        </w:rPr>
+        <w:t>🔌</w:t>
+      </w:r>
+    </w:p>
+    <w:p>
+      <w:pPr>
+        <w:rPr>
+          <w:b/>
+          <w:bCs/>
+        </w:rPr>
+      </w:pPr>
+      <w:r>
+        <w:rPr>
+          <w:b/>
+          <w:bCs/>
+        </w:rPr>
+        <w:t>Top skills</w:t>
+      </w:r>
+    </w:p>
+    <w:p>
+      <w:r>
+        <w:t>Cloud Computing • Artificial Intelligence (AI) • Simplifying the Complex • Training • Mentoring</w:t>
+      </w:r>
+    </w:p>
+    <w:p>
+      <w:pPr>
+        <w:rPr>
+          <w:b/>
+          <w:bCs/>
+        </w:rPr>
+      </w:pPr>
+      <w:r>
+        <w:rPr>
+          <w:b/>
+          <w:bCs/>
+        </w:rPr>
+        <w:t>Experience</w:t>
+      </w:r>
+    </w:p>
+    <w:p>
+      <w:r>
+        <w:rPr>
+          <w:noProof/>
+        </w:rPr>
         <w:lastRenderedPageBreak/>
-        <w:t>My studies and industry experience allowed me to explore both sides of that curiosity. I found myself not only solving technical problems, but also explaining them - translating complex concepts into practical and meaningful conversations for people without technical backgrounds. That realisation eventually influenced my decision to broaden my studies beyond technology and into areas focused on people, recognising that even the most successful technology still depends on people using it with confidence.</w:t>
-      </w:r>
-      <w:r>
-        <w:br/>
-        <w:t> </w:t>
-      </w:r>
-      <w:r>
-        <w:br/>
-        <w:t>More than 20 years later, I still enjoy every small fix, every successful Lambda call and every SageMaker training job completed with the same curiosity I had fixing that first radio. While the technology has changed - evolving from consumer electronics to infrastructure, Cloud and now AI - the principle has remained the same: curiosity and perseverance.</w:t>
-      </w:r>
-      <w:r>
-        <w:br/>
-        <w:t> </w:t>
-      </w:r>
-      <w:r>
-        <w:br/>
-        <w:t>Over time, my career evolved into becoming an in-betweener, communicator and translator between technical teams and the broader business - helping bridge silos, build understanding and align people around shared goals. Whether supporting a CEO making a technical decision or mentoring someone new to IT, I enjoy making technology feel less intimidating and more useful.</w:t>
-      </w:r>
-      <w:r>
-        <w:br/>
-        <w:t> </w:t>
-      </w:r>
-      <w:r>
-        <w:br/>
-        <w:t>Through mentoring and coaching, I’ve learned that sometimes the best approach is not to give the answer, but to point people in the right direction and empower them to come up with even better ideas themselves.</w:t>
-      </w:r>
-      <w:r>
-        <w:br/>
-        <w:t> </w:t>
-      </w:r>
-      <w:r>
-        <w:br/>
-        <w:t xml:space="preserve">I’m always open to connecting with others to share ideas, industry insights or simply talk technology, people and the spaces where they intersect. If this resonates - let’s connect </w:t>
-      </w:r>
-      <w:r>
-        <w:rPr>
-          <w:rFonts w:ascii="Segoe UI Emoji" w:hAnsi="Segoe UI Emoji" w:cs="Segoe UI Emoji"/>
-        </w:rPr>
-        <w:t>🔌</w:t>
-      </w:r>
-    </w:p>
-    <w:p>
-      <w:pPr>
-        <w:rPr>
-          <w:b/>
-          <w:bCs/>
-        </w:rPr>
-      </w:pPr>
-      <w:r>
-        <w:rPr>
-          <w:b/>
-          <w:bCs/>
-        </w:rPr>
-        <w:t>Top skills</w:t>
-      </w:r>
-    </w:p>
-    <w:p>
-      <w:r>
-        <w:t>Cloud Computing • Artificial Intelligence (AI) • Simplifying the Complex • Training • Mentoring</w:t>
-      </w:r>
-    </w:p>
-    <w:p>
-      <w:pPr>
-        <w:rPr>
-          <w:b/>
-          <w:bCs/>
-        </w:rPr>
-      </w:pPr>
-      <w:r>
-        <w:rPr>
-          <w:b/>
-          <w:bCs/>
-        </w:rPr>
-        <w:t>Experience</w:t>
-      </w:r>
-    </w:p>
-    <w:p>
-      <w:r>
         <w:drawing>
           <wp:inline distT="0" distB="0" distL="0" distR="0" wp14:anchorId="26368EC0" wp14:editId="1A3EAF66">
             <wp:extent cx="952500" cy="952500"/>
@@ -457,134 +492,134 @@
         <w:rPr>
           <w:rStyle w:val="Hyperlink"/>
         </w:rPr>
+        <w:t xml:space="preserve">Jan 2026 - Present · 7 </w:t>
+      </w:r>
+      <w:proofErr w:type="spellStart"/>
+      <w:r>
+        <w:rPr>
+          <w:rStyle w:val="Hyperlink"/>
+        </w:rPr>
+        <w:t>mos</w:t>
+      </w:r>
+      <w:proofErr w:type="spellEnd"/>
+    </w:p>
+    <w:p>
+      <w:pPr>
+        <w:rPr>
+          <w:rStyle w:val="Hyperlink"/>
+        </w:rPr>
+      </w:pPr>
+      <w:r>
+        <w:rPr>
+          <w:rStyle w:val="Hyperlink"/>
+        </w:rPr>
+        <w:t>Sydney, New South Wales, Australia</w:t>
+      </w:r>
+    </w:p>
+    <w:p>
+      <w:r>
+        <w:fldChar w:fldCharType="end"/>
+      </w:r>
+    </w:p>
+    <w:p>
+      <w:r>
+        <w:t>Supported customer and partner enablement initiatives within enterprise technology environments, helping learners adopt and better understand the Snowflake platform across AWS, Azure and GCP ecosystems.</w:t>
+      </w:r>
+      <w:r>
+        <w:br/>
+      </w:r>
+      <w:r>
+        <w:br/>
+      </w:r>
+      <w:r>
+        <w:rPr>
+          <w:rFonts w:ascii="Segoe UI Symbol" w:hAnsi="Segoe UI Symbol" w:cs="Segoe UI Symbol"/>
+        </w:rPr>
+        <w:t>♦</w:t>
+      </w:r>
+      <w:r>
+        <w:t xml:space="preserve"> Delivered customer and partner training across Snowflake platform capabilities and workflows, consistently achieving 90%+ learner satisfaction through engaging and practical technical education that supported platform adoption and user confidence.</w:t>
+      </w:r>
+      <w:r>
+        <w:br/>
+      </w:r>
+      <w:r>
+        <w:br/>
+      </w:r>
+      <w:r>
+        <w:rPr>
+          <w:rFonts w:ascii="Segoe UI Symbol" w:hAnsi="Segoe UI Symbol" w:cs="Segoe UI Symbol"/>
+        </w:rPr>
+        <w:t>♦</w:t>
+      </w:r>
+      <w:r>
+        <w:t xml:space="preserve"> Facilitated technical enablement initiatives and cross-functional learning activities, including customer engagement and AWS-related events, strengthening stakeholder engagement and supporting broader adoption of Cloud and data solutions.</w:t>
+      </w:r>
+      <w:r>
+        <w:br/>
+      </w:r>
+      <w:r>
+        <w:br/>
+      </w:r>
+      <w:r>
+        <w:rPr>
+          <w:rFonts w:ascii="Segoe UI Symbol" w:hAnsi="Segoe UI Symbol" w:cs="Segoe UI Symbol"/>
+        </w:rPr>
+        <w:t>♦</w:t>
+      </w:r>
+      <w:r>
+        <w:t xml:space="preserve"> Tailored technical content and learning approaches to suit varied technical and non-technical audiences, simplifying complex platform concepts into practical and accessible learning outcomes that improved understanding and reduced barriers to adoption.</w:t>
+      </w:r>
+      <w:r>
+        <w:br/>
+      </w:r>
+      <w:r>
+        <w:br/>
+      </w:r>
+      <w:r>
+        <w:rPr>
+          <w:rFonts w:ascii="Segoe UI Symbol" w:hAnsi="Segoe UI Symbol" w:cs="Segoe UI Symbol"/>
+        </w:rPr>
+        <w:t>♦</w:t>
+      </w:r>
+      <w:r>
+        <w:t xml:space="preserve"> Mentored and coached learners and internal staff, supporting technical capability, enhancing communication skills and professional development while helping build confidence and workplace effectiveness, resulting in workplace promotions, engagement and retention of talent.</w:t>
+      </w:r>
+      <w:r>
+        <w:br/>
+      </w:r>
+      <w:r>
+        <w:br/>
+      </w:r>
+      <w:r>
+        <w:rPr>
+          <w:rFonts w:ascii="Segoe UI Symbol" w:hAnsi="Segoe UI Symbol" w:cs="Segoe UI Symbol"/>
+        </w:rPr>
+        <w:t>♦</w:t>
+      </w:r>
+      <w:r>
+        <w:t xml:space="preserve"> Contributed to knowledge-sharing and enablement initiatives like videos and demos, supporting ongoing customer success and adoption of the company</w:t>
+      </w:r>
+      <w:r>
+        <w:rPr>
+          <w:rFonts w:ascii="Aptos" w:hAnsi="Aptos" w:cs="Aptos"/>
+        </w:rPr>
+        <w:t>’</w:t>
+      </w:r>
+      <w:r>
+        <w:t xml:space="preserve">s software with customers including CBA and government. </w:t>
+      </w:r>
+      <w:r>
+        <w:br/>
+      </w:r>
+      <w:r>
+        <w:br/>
+      </w:r>
+      <w:r>
+        <w:rPr>
+          <w:rFonts w:ascii="Segoe UI Symbol" w:hAnsi="Segoe UI Symbol" w:cs="Segoe UI Symbol"/>
+        </w:rPr>
         <w:lastRenderedPageBreak/>
-        <w:t xml:space="preserve">Jan 2026 - Present · 7 </w:t>
-      </w:r>
-      <w:proofErr w:type="spellStart"/>
-      <w:r>
-        <w:rPr>
-          <w:rStyle w:val="Hyperlink"/>
-        </w:rPr>
-        <w:t>mos</w:t>
-      </w:r>
-      <w:proofErr w:type="spellEnd"/>
-    </w:p>
-    <w:p>
-      <w:pPr>
-        <w:rPr>
-          <w:rStyle w:val="Hyperlink"/>
-        </w:rPr>
-      </w:pPr>
-      <w:r>
-        <w:rPr>
-          <w:rStyle w:val="Hyperlink"/>
-        </w:rPr>
-        <w:t>Sydney, New South Wales, Australia</w:t>
-      </w:r>
-    </w:p>
-    <w:p>
-      <w:r>
-        <w:fldChar w:fldCharType="end"/>
-      </w:r>
-    </w:p>
-    <w:p>
-      <w:r>
-        <w:t>Supported customer and partner enablement initiatives within enterprise technology environments, helping learners adopt and better understand the Snowflake platform across AWS, Azure and GCP ecosystems.</w:t>
-      </w:r>
-      <w:r>
-        <w:br/>
-      </w:r>
-      <w:r>
-        <w:br/>
-      </w:r>
-      <w:r>
-        <w:rPr>
-          <w:rFonts w:ascii="Segoe UI Symbol" w:hAnsi="Segoe UI Symbol" w:cs="Segoe UI Symbol"/>
-        </w:rPr>
-        <w:t>♦</w:t>
-      </w:r>
-      <w:r>
-        <w:t xml:space="preserve"> Delivered customer and partner training across Snowflake platform capabilities and workflows, consistently achieving 90%+ learner satisfaction through engaging and practical technical education that supported platform adoption and user confidence.</w:t>
-      </w:r>
-      <w:r>
-        <w:br/>
-      </w:r>
-      <w:r>
-        <w:br/>
-      </w:r>
-      <w:r>
-        <w:rPr>
-          <w:rFonts w:ascii="Segoe UI Symbol" w:hAnsi="Segoe UI Symbol" w:cs="Segoe UI Symbol"/>
-        </w:rPr>
-        <w:t>♦</w:t>
-      </w:r>
-      <w:r>
-        <w:t xml:space="preserve"> Facilitated technical enablement initiatives and cross-functional learning activities, including customer engagement and AWS-related events, strengthening stakeholder engagement and supporting broader adoption of Cloud and data solutions.</w:t>
-      </w:r>
-      <w:r>
-        <w:br/>
-      </w:r>
-      <w:r>
-        <w:br/>
-      </w:r>
-      <w:r>
-        <w:rPr>
-          <w:rFonts w:ascii="Segoe UI Symbol" w:hAnsi="Segoe UI Symbol" w:cs="Segoe UI Symbol"/>
-        </w:rPr>
-        <w:t>♦</w:t>
-      </w:r>
-      <w:r>
-        <w:t xml:space="preserve"> Tailored technical content and learning approaches to suit varied technical and non-technical audiences, simplifying complex platform concepts into practical and accessible learning outcomes that improved understanding and reduced barriers to adoption.</w:t>
-      </w:r>
-      <w:r>
-        <w:br/>
-      </w:r>
-      <w:r>
-        <w:br/>
-      </w:r>
-      <w:r>
-        <w:rPr>
-          <w:rFonts w:ascii="Segoe UI Symbol" w:hAnsi="Segoe UI Symbol" w:cs="Segoe UI Symbol"/>
-        </w:rPr>
-        <w:t>♦</w:t>
-      </w:r>
-      <w:r>
-        <w:t xml:space="preserve"> Mentored and coached learners and internal staff, supporting technical capability, enhancing communication skills and professional development while helping build confidence and workplace effectiveness, resulting in workplace promotions, engagement and retention of talent.</w:t>
-      </w:r>
-      <w:r>
-        <w:br/>
-      </w:r>
-      <w:r>
-        <w:br/>
-      </w:r>
-      <w:r>
-        <w:rPr>
-          <w:rFonts w:ascii="Segoe UI Symbol" w:hAnsi="Segoe UI Symbol" w:cs="Segoe UI Symbol"/>
-        </w:rPr>
-        <w:t>♦</w:t>
-      </w:r>
-      <w:r>
-        <w:t xml:space="preserve"> Contributed to knowledge-sharing and enablement initiatives like videos and demos, supporting ongoing customer success and adoption of the company</w:t>
-      </w:r>
-      <w:r>
-        <w:rPr>
-          <w:rFonts w:ascii="Aptos" w:hAnsi="Aptos" w:cs="Aptos"/>
-        </w:rPr>
-        <w:t>’</w:t>
-      </w:r>
-      <w:r>
-        <w:t xml:space="preserve">s software with customers including CBA and government. </w:t>
-      </w:r>
-      <w:r>
-        <w:br/>
-      </w:r>
-      <w:r>
-        <w:br/>
-      </w:r>
-      <w:r>
-        <w:rPr>
-          <w:rFonts w:ascii="Segoe UI Symbol" w:hAnsi="Segoe UI Symbol" w:cs="Segoe UI Symbol"/>
-        </w:rPr>
         <w:t>♦</w:t>
       </w:r>
       <w:r>
@@ -612,13 +647,15 @@
     <w:p>
       <w:r>
         <w:pict w14:anchorId="160F18BF">
-          <v:rect id="_x0000_i1056" style="width:0;height:1.5pt" o:hralign="center" o:hrstd="t" o:hr="t" fillcolor="#a0a0a0" stroked="f"/>
+          <v:rect id="_x0000_i1025" style="width:0;height:1.5pt" o:hralign="center" o:hrstd="t" o:hr="t" fillcolor="#a0a0a0" stroked="f"/>
         </w:pict>
       </w:r>
     </w:p>
     <w:p>
       <w:r>
-        <w:lastRenderedPageBreak/>
+        <w:rPr>
+          <w:noProof/>
+        </w:rPr>
         <w:drawing>
           <wp:inline distT="0" distB="0" distL="0" distR="0" wp14:anchorId="5C350551" wp14:editId="27E301AA">
             <wp:extent cx="952500" cy="952500"/>
@@ -855,7 +892,11 @@
         <w:t>♦</w:t>
       </w:r>
       <w:r>
-        <w:t xml:space="preserve"> Developed and facilitated engaging technical workshops, demonstrations and practical learning environments enabling cohorts of 10–20 learners to build production-style Cloud and infrastructure solutions that improved practical capability and real-world application of skills.</w:t>
+        <w:t xml:space="preserve"> Developed and facilitated engaging technical workshops, demonstrations and practical learning environments enabling cohorts of 10–20 learners to build production-</w:t>
+      </w:r>
+      <w:r>
+        <w:lastRenderedPageBreak/>
+        <w:t>style Cloud and infrastructure solutions that improved practical capability and real-world application of skills.</w:t>
       </w:r>
       <w:r>
         <w:br/>
@@ -870,11 +911,7 @@
         <w:t>♦</w:t>
       </w:r>
       <w:r>
-        <w:t xml:space="preserve"> Customised training delivery to support learners from diverse technical and professional backgrounds, helping career changers, return-to-work professionals and ex-forces build confidence and workplace readiness while improving engagement and </w:t>
-      </w:r>
-      <w:r>
-        <w:lastRenderedPageBreak/>
-        <w:t>successful transition into technical environments.</w:t>
+        <w:t xml:space="preserve"> Customised training delivery to support learners from diverse technical and professional backgrounds, helping career changers, return-to-work professionals and ex-forces build confidence and workplace readiness while improving engagement and successful transition into technical environments.</w:t>
       </w:r>
       <w:r>
         <w:br/>
@@ -1051,6 +1088,7 @@
     </w:p>
     <w:p>
       <w:r>
+        <w:lastRenderedPageBreak/>
         <w:t>Career, Goal Setting &amp; Self Development, Health &amp; Lifestyle, Motivation &amp; Time Management, Relationships &amp; Personal Issues, Stress Management, Team Management</w:t>
       </w:r>
     </w:p>
@@ -1062,8 +1100,15 @@
     </w:p>
     <w:p>
       <w:r>
-        <w:lastRenderedPageBreak/>
-        <w:t>Carles is a Martial Arts &amp; Life Coach certified by the ICF with more than 20 years of experience solving problems. Including training in several roles (5+ years as a full time trainer), helping people solve their own problems through empowering them and offering knowledge when needed. If there is an industry that is big in problem solving, that is IT.</w:t>
+        <w:t xml:space="preserve">Carles is a Martial Arts &amp; Life Coach certified by the ICF with more than 20 years of experience solving problems. Including training in several roles (5+ years as a </w:t>
+      </w:r>
+      <w:proofErr w:type="gramStart"/>
+      <w:r>
+        <w:t>full time</w:t>
+      </w:r>
+      <w:proofErr w:type="gramEnd"/>
+      <w:r>
+        <w:t xml:space="preserve"> trainer), helping people solve their own problems through empowering them and offering knowledge when needed. If there is an industry that is big in problem solving, that is IT.</w:t>
       </w:r>
     </w:p>
     <w:p/>
@@ -1130,7 +1175,6 @@
     <w:p/>
     <w:p>
       <w:r>
-        <w:lastRenderedPageBreak/>
         <w:t>Lots of books, courses and meditation: big focus on Strength, Resilience, Confidence, Mindset &amp; Masculinity</w:t>
       </w:r>
     </w:p>
@@ -1933,6 +1977,7 @@
   <w:style w:type="character" w:default="1" w:styleId="DefaultParagraphFont">
     <w:name w:val="Default Paragraph Font"/>
     <w:uiPriority w:val="1"/>
+    <w:semiHidden/>
     <w:unhideWhenUsed/>
   </w:style>
   <w:style w:type="table" w:default="1" w:styleId="TableNormal">

</xml_diff>